<commit_message>
15/04/2026 chore: unifica textos de vacío en listado de muebles
Se alinea el mensaje cuando no hay resultados con otras pantallas del catálogo.
</commit_message>
<xml_diff>
--- a/eco_woods/Documentacion/14_04_2026.docx
+++ b/eco_woods/Documentacion/14_04_2026.docx
@@ -11,6 +11,13 @@
       </w:r>
     </w:p>
     <w:p>
+      <w:r>
+        <w:rPr>
+          <w:b/>
+          <w:bCs/>
+        </w:rPr>
+        <w:t>T</w:t>
+      </w:r>
       <w:r>
         <w:rPr>
           <w:b/>
@@ -812,6 +819,7 @@
   <w:style w:type="character" w:default="1" w:styleId="Fuentedeprrafopredeter">
     <w:name w:val="Default Paragraph Font"/>
     <w:uiPriority w:val="1"/>
+    <w:semiHidden/>
     <w:unhideWhenUsed/>
   </w:style>
   <w:style w:type="table" w:default="1" w:styleId="Tablanormal">

</xml_diff>